<commit_message>
Tercer commit: Literal B terminado
</commit_message>
<xml_diff>
--- a/informe.docx
+++ b/informe.docx
@@ -180,14 +180,135 @@
       <w:pPr>
         <w:pStyle w:val="Prrafodelista"/>
         <w:spacing w:line="360" w:lineRule="auto"/>
+      </w:pPr>
+      <w:r>
+        <w:t>Por último, las piezas se deberían de generar bajo un criterio de aleatoriedad para asegurar que el usuario no sepa que pieza sigue y de esta manera asegurar una buena jugabilidad.</w:t>
+      </w:r>
+    </w:p>
+    <w:p>
+      <w:pPr>
+        <w:pStyle w:val="Prrafodelista"/>
+        <w:spacing w:line="360" w:lineRule="auto"/>
+      </w:pPr>
+    </w:p>
+    <w:p>
+      <w:pPr>
+        <w:pStyle w:val="Prrafodelista"/>
+        <w:numPr>
+          <w:ilvl w:val="0"/>
+          <w:numId w:val="1"/>
+        </w:numPr>
+        <w:spacing w:line="360" w:lineRule="auto"/>
         <w:rPr>
           <w:b/>
           <w:bCs/>
         </w:rPr>
       </w:pPr>
       <w:r>
-        <w:t>Por último, las piezas se deberían de generar bajo un criterio de aleatoriedad para asegurar que el usuario no sepa que pieza sigue y de esta manera asegurar una buena jugabilidad.</w:t>
-      </w:r>
+        <w:rPr>
+          <w:b/>
+          <w:bCs/>
+        </w:rPr>
+        <w:t>Esquema donde describa las tareas que usted definió en el desarrollo de los algoritmos:</w:t>
+      </w:r>
+    </w:p>
+    <w:p>
+      <w:pPr>
+        <w:pStyle w:val="Prrafodelista"/>
+        <w:numPr>
+          <w:ilvl w:val="0"/>
+          <w:numId w:val="2"/>
+        </w:numPr>
+        <w:spacing w:line="360" w:lineRule="auto"/>
+      </w:pPr>
+      <w:r>
+        <w:t xml:space="preserve">Primero: es importante verificar que el ancho del tablero sea un </w:t>
+      </w:r>
+      <w:r>
+        <w:rPr>
+          <w:u w:val="single"/>
+        </w:rPr>
+        <w:t>múltiplo de 8</w:t>
+      </w:r>
+      <w:r>
+        <w:t>.</w:t>
+      </w:r>
+    </w:p>
+    <w:p>
+      <w:pPr>
+        <w:pStyle w:val="Prrafodelista"/>
+        <w:numPr>
+          <w:ilvl w:val="0"/>
+          <w:numId w:val="2"/>
+        </w:numPr>
+        <w:spacing w:line="360" w:lineRule="auto"/>
+      </w:pPr>
+      <w:r>
+        <w:t xml:space="preserve">Segundo: generar las </w:t>
+      </w:r>
+      <w:r>
+        <w:rPr>
+          <w:u w:val="single"/>
+        </w:rPr>
+        <w:t>representaciones de las 7 piezas</w:t>
+      </w:r>
+      <w:r>
+        <w:t xml:space="preserve"> que van a hacer parte de nuestro Tetris, las cuales serán hechas mediante máscaras de bits.</w:t>
+      </w:r>
+    </w:p>
+    <w:p>
+      <w:pPr>
+        <w:pStyle w:val="Prrafodelista"/>
+        <w:numPr>
+          <w:ilvl w:val="0"/>
+          <w:numId w:val="2"/>
+        </w:numPr>
+        <w:spacing w:line="360" w:lineRule="auto"/>
+      </w:pPr>
+      <w:r>
+        <w:t xml:space="preserve">Tercero: lograr que se </w:t>
+      </w:r>
+      <w:r>
+        <w:rPr>
+          <w:u w:val="single"/>
+        </w:rPr>
+        <w:t>detecten las colisiones de las mascaras</w:t>
+      </w:r>
+      <w:r>
+        <w:t xml:space="preserve"> de las piezas con el estado actual que tenga el tablero en un momento dado. Acá es importante el operador &amp; para asegurar la veracidad de varias condiciones.</w:t>
+      </w:r>
+    </w:p>
+    <w:p>
+      <w:pPr>
+        <w:pStyle w:val="Prrafodelista"/>
+        <w:numPr>
+          <w:ilvl w:val="0"/>
+          <w:numId w:val="2"/>
+        </w:numPr>
+        <w:spacing w:line="360" w:lineRule="auto"/>
+      </w:pPr>
+      <w:r>
+        <w:t>Cuarto: se hace necesario saber como con cada mascara sucesiva el</w:t>
+      </w:r>
+      <w:r>
+        <w:rPr>
+          <w:u w:val="single"/>
+        </w:rPr>
+        <w:t xml:space="preserve"> tablero se va a actualizar</w:t>
+      </w:r>
+      <w:r>
+        <w:t>.</w:t>
+      </w:r>
+    </w:p>
+    <w:p>
+      <w:pPr>
+        <w:pStyle w:val="Prrafodelista"/>
+        <w:spacing w:line="360" w:lineRule="auto"/>
+        <w:rPr>
+          <w:b/>
+          <w:bCs/>
+        </w:rPr>
+      </w:pPr>
     </w:p>
     <w:sectPr>
       <w:pgSz w:w="12240" w:h="15840"/>
@@ -291,8 +412,124 @@
       </w:pPr>
     </w:lvl>
   </w:abstractNum>
+  <w:abstractNum w:abstractNumId="1" w15:restartNumberingAfterBreak="0">
+    <w:nsid w:val="632015B1"/>
+    <w:multiLevelType w:val="hybridMultilevel"/>
+    <w:tmpl w:val="F57896A4"/>
+    <w:lvl w:ilvl="0" w:tplc="72A0EBF6">
+      <w:start w:val="2"/>
+      <w:numFmt w:val="bullet"/>
+      <w:lvlText w:val="-"/>
+      <w:lvlJc w:val="left"/>
+      <w:pPr>
+        <w:ind w:left="1080" w:hanging="360"/>
+      </w:pPr>
+      <w:rPr>
+        <w:rFonts w:ascii="Calibri" w:eastAsiaTheme="minorHAnsi" w:hAnsi="Calibri" w:cs="Calibri" w:hint="default"/>
+      </w:rPr>
+    </w:lvl>
+    <w:lvl w:ilvl="1" w:tplc="240A0003" w:tentative="1">
+      <w:start w:val="1"/>
+      <w:numFmt w:val="bullet"/>
+      <w:lvlText w:val="o"/>
+      <w:lvlJc w:val="left"/>
+      <w:pPr>
+        <w:ind w:left="1800" w:hanging="360"/>
+      </w:pPr>
+      <w:rPr>
+        <w:rFonts w:ascii="Courier New" w:hAnsi="Courier New" w:cs="Courier New" w:hint="default"/>
+      </w:rPr>
+    </w:lvl>
+    <w:lvl w:ilvl="2" w:tplc="240A0005" w:tentative="1">
+      <w:start w:val="1"/>
+      <w:numFmt w:val="bullet"/>
+      <w:lvlText w:val=""/>
+      <w:lvlJc w:val="left"/>
+      <w:pPr>
+        <w:ind w:left="2520" w:hanging="360"/>
+      </w:pPr>
+      <w:rPr>
+        <w:rFonts w:ascii="Wingdings" w:hAnsi="Wingdings" w:hint="default"/>
+      </w:rPr>
+    </w:lvl>
+    <w:lvl w:ilvl="3" w:tplc="240A0001" w:tentative="1">
+      <w:start w:val="1"/>
+      <w:numFmt w:val="bullet"/>
+      <w:lvlText w:val=""/>
+      <w:lvlJc w:val="left"/>
+      <w:pPr>
+        <w:ind w:left="3240" w:hanging="360"/>
+      </w:pPr>
+      <w:rPr>
+        <w:rFonts w:ascii="Symbol" w:hAnsi="Symbol" w:hint="default"/>
+      </w:rPr>
+    </w:lvl>
+    <w:lvl w:ilvl="4" w:tplc="240A0003" w:tentative="1">
+      <w:start w:val="1"/>
+      <w:numFmt w:val="bullet"/>
+      <w:lvlText w:val="o"/>
+      <w:lvlJc w:val="left"/>
+      <w:pPr>
+        <w:ind w:left="3960" w:hanging="360"/>
+      </w:pPr>
+      <w:rPr>
+        <w:rFonts w:ascii="Courier New" w:hAnsi="Courier New" w:cs="Courier New" w:hint="default"/>
+      </w:rPr>
+    </w:lvl>
+    <w:lvl w:ilvl="5" w:tplc="240A0005" w:tentative="1">
+      <w:start w:val="1"/>
+      <w:numFmt w:val="bullet"/>
+      <w:lvlText w:val=""/>
+      <w:lvlJc w:val="left"/>
+      <w:pPr>
+        <w:ind w:left="4680" w:hanging="360"/>
+      </w:pPr>
+      <w:rPr>
+        <w:rFonts w:ascii="Wingdings" w:hAnsi="Wingdings" w:hint="default"/>
+      </w:rPr>
+    </w:lvl>
+    <w:lvl w:ilvl="6" w:tplc="240A0001" w:tentative="1">
+      <w:start w:val="1"/>
+      <w:numFmt w:val="bullet"/>
+      <w:lvlText w:val=""/>
+      <w:lvlJc w:val="left"/>
+      <w:pPr>
+        <w:ind w:left="5400" w:hanging="360"/>
+      </w:pPr>
+      <w:rPr>
+        <w:rFonts w:ascii="Symbol" w:hAnsi="Symbol" w:hint="default"/>
+      </w:rPr>
+    </w:lvl>
+    <w:lvl w:ilvl="7" w:tplc="240A0003" w:tentative="1">
+      <w:start w:val="1"/>
+      <w:numFmt w:val="bullet"/>
+      <w:lvlText w:val="o"/>
+      <w:lvlJc w:val="left"/>
+      <w:pPr>
+        <w:ind w:left="6120" w:hanging="360"/>
+      </w:pPr>
+      <w:rPr>
+        <w:rFonts w:ascii="Courier New" w:hAnsi="Courier New" w:cs="Courier New" w:hint="default"/>
+      </w:rPr>
+    </w:lvl>
+    <w:lvl w:ilvl="8" w:tplc="240A0005" w:tentative="1">
+      <w:start w:val="1"/>
+      <w:numFmt w:val="bullet"/>
+      <w:lvlText w:val=""/>
+      <w:lvlJc w:val="left"/>
+      <w:pPr>
+        <w:ind w:left="6840" w:hanging="360"/>
+      </w:pPr>
+      <w:rPr>
+        <w:rFonts w:ascii="Wingdings" w:hAnsi="Wingdings" w:hint="default"/>
+      </w:rPr>
+    </w:lvl>
+  </w:abstractNum>
   <w:num w:numId="1">
     <w:abstractNumId w:val="0"/>
+  </w:num>
+  <w:num w:numId="2">
+    <w:abstractNumId w:val="1"/>
   </w:num>
 </w:numbering>
 </file>

</xml_diff>

<commit_message>
Cuarto Commit: Literal C y D terminado
</commit_message>
<xml_diff>
--- a/informe.docx
+++ b/informe.docx
@@ -222,7 +222,13 @@
         <w:spacing w:line="360" w:lineRule="auto"/>
       </w:pPr>
       <w:r>
-        <w:t xml:space="preserve">Primero: es importante verificar que el ancho del tablero sea un </w:t>
+        <w:t xml:space="preserve">Primero: </w:t>
+      </w:r>
+      <w:r>
+        <w:t>E</w:t>
+      </w:r>
+      <w:r>
+        <w:t xml:space="preserve">s importante verificar que el ancho del tablero sea un </w:t>
       </w:r>
       <w:r>
         <w:rPr>
@@ -244,7 +250,13 @@
         <w:spacing w:line="360" w:lineRule="auto"/>
       </w:pPr>
       <w:r>
-        <w:t xml:space="preserve">Segundo: generar las </w:t>
+        <w:t xml:space="preserve">Segundo: </w:t>
+      </w:r>
+      <w:r>
+        <w:t>G</w:t>
+      </w:r>
+      <w:r>
+        <w:t xml:space="preserve">enerar las </w:t>
       </w:r>
       <w:r>
         <w:rPr>
@@ -266,7 +278,13 @@
         <w:spacing w:line="360" w:lineRule="auto"/>
       </w:pPr>
       <w:r>
-        <w:t xml:space="preserve">Tercero: lograr que se </w:t>
+        <w:t xml:space="preserve">Tercero: </w:t>
+      </w:r>
+      <w:r>
+        <w:t>L</w:t>
+      </w:r>
+      <w:r>
+        <w:t xml:space="preserve">ograr que se </w:t>
       </w:r>
       <w:r>
         <w:rPr>
@@ -288,7 +306,13 @@
         <w:spacing w:line="360" w:lineRule="auto"/>
       </w:pPr>
       <w:r>
-        <w:t>Cuarto: se hace necesario saber como con cada mascara sucesiva el</w:t>
+        <w:t xml:space="preserve">Cuarto: </w:t>
+      </w:r>
+      <w:r>
+        <w:t>S</w:t>
+      </w:r>
+      <w:r>
+        <w:t>e hace necesario saber como con cada mascara sucesiva el</w:t>
       </w:r>
       <w:r>
         <w:rPr>
@@ -298,6 +322,165 @@
       </w:r>
       <w:r>
         <w:t>.</w:t>
+      </w:r>
+    </w:p>
+    <w:p>
+      <w:pPr>
+        <w:pStyle w:val="Prrafodelista"/>
+        <w:spacing w:line="360" w:lineRule="auto"/>
+        <w:ind w:left="1080"/>
+      </w:pPr>
+    </w:p>
+    <w:p>
+      <w:pPr>
+        <w:pStyle w:val="Prrafodelista"/>
+        <w:numPr>
+          <w:ilvl w:val="0"/>
+          <w:numId w:val="1"/>
+        </w:numPr>
+        <w:spacing w:line="360" w:lineRule="auto"/>
+        <w:rPr>
+          <w:b/>
+          <w:bCs/>
+        </w:rPr>
+      </w:pPr>
+      <w:r>
+        <w:rPr>
+          <w:b/>
+          <w:bCs/>
+        </w:rPr>
+        <w:t>Algoritmos Implementados:</w:t>
+      </w:r>
+      <w:r>
+        <w:rPr>
+          <w:b/>
+          <w:bCs/>
+        </w:rPr>
+        <w:t xml:space="preserve"> </w:t>
+      </w:r>
+    </w:p>
+    <w:p>
+      <w:pPr>
+        <w:pStyle w:val="Prrafodelista"/>
+        <w:numPr>
+          <w:ilvl w:val="0"/>
+          <w:numId w:val="2"/>
+        </w:numPr>
+        <w:spacing w:line="360" w:lineRule="auto"/>
+        <w:rPr>
+          <w:b/>
+          <w:bCs/>
+        </w:rPr>
+      </w:pPr>
+      <w:r>
+        <w:rPr>
+          <w:b/>
+          <w:bCs/>
+        </w:rPr>
+        <w:t xml:space="preserve">Primero: </w:t>
+      </w:r>
+      <w:r>
+        <w:t xml:space="preserve">Se busca utilizar un </w:t>
+      </w:r>
+      <w:r>
+        <w:rPr>
+          <w:u w:val="single"/>
+        </w:rPr>
+        <w:t>algoritmo de rotación</w:t>
+      </w:r>
+      <w:r>
+        <w:rPr>
+          <w:b/>
+          <w:bCs/>
+        </w:rPr>
+        <w:t xml:space="preserve"> </w:t>
+      </w:r>
+      <w:r>
+        <w:t>para generar las 4 rotaciones de cada pieza, los cuales cambiaran según la entrada que defina el usuario</w:t>
+      </w:r>
+    </w:p>
+    <w:p>
+      <w:pPr>
+        <w:pStyle w:val="Prrafodelista"/>
+        <w:numPr>
+          <w:ilvl w:val="0"/>
+          <w:numId w:val="2"/>
+        </w:numPr>
+        <w:spacing w:line="360" w:lineRule="auto"/>
+        <w:rPr>
+          <w:b/>
+          <w:bCs/>
+        </w:rPr>
+      </w:pPr>
+      <w:r>
+        <w:rPr>
+          <w:b/>
+          <w:bCs/>
+        </w:rPr>
+        <w:lastRenderedPageBreak/>
+        <w:t xml:space="preserve">Segundo: </w:t>
+      </w:r>
+      <w:r>
+        <w:t xml:space="preserve">Se necesita un </w:t>
+      </w:r>
+      <w:r>
+        <w:rPr>
+          <w:u w:val="single"/>
+        </w:rPr>
+        <w:t>algoritmo de limpieza</w:t>
+      </w:r>
+      <w:r>
+        <w:t>, que se activara en el momento en que una fila del tablero tenga todos sus bits en 1, cuando esto ocurra se pasa a liberar toda esa memoria y desplazar los punteros una fila más abajo.</w:t>
+      </w:r>
+    </w:p>
+    <w:p>
+      <w:pPr>
+        <w:pStyle w:val="Prrafodelista"/>
+        <w:spacing w:line="360" w:lineRule="auto"/>
+        <w:ind w:left="1080"/>
+        <w:rPr>
+          <w:b/>
+          <w:bCs/>
+        </w:rPr>
+      </w:pPr>
+    </w:p>
+    <w:p>
+      <w:pPr>
+        <w:pStyle w:val="Prrafodelista"/>
+        <w:numPr>
+          <w:ilvl w:val="0"/>
+          <w:numId w:val="1"/>
+        </w:numPr>
+        <w:spacing w:line="360" w:lineRule="auto"/>
+        <w:rPr>
+          <w:b/>
+          <w:bCs/>
+        </w:rPr>
+      </w:pPr>
+      <w:r>
+        <w:rPr>
+          <w:b/>
+          <w:bCs/>
+        </w:rPr>
+        <w:t xml:space="preserve">Problemas de desarrollo que afronto: </w:t>
+      </w:r>
+    </w:p>
+    <w:p>
+      <w:pPr>
+        <w:pStyle w:val="Prrafodelista"/>
+        <w:spacing w:line="360" w:lineRule="auto"/>
+      </w:pPr>
+      <w:r>
+        <w:t xml:space="preserve">Hay dos problemas principales que todavía </w:t>
+      </w:r>
+      <w:r>
+        <w:t>estoy evaluando y buscando soluciones</w:t>
+      </w:r>
+      <w:r>
+        <w:t>:</w:t>
+      </w:r>
+      <w:r>
+        <w:t xml:space="preserve"> En primer lugar, es saber dónde sacar la pieza nueva en el tablero ya que cada tablero puede tener diferente tamaño siendo múltiplos de 8, cada pieza nueva debe salir en el centro del ancho definido por el usuario. En segundo lugar, esta evitar el desbordamiento de las piezas cuando estas se acercan a los bordes laterales del tablero, lo cual requiere hacer validaciones constantes de estos bordes.</w:t>
       </w:r>
     </w:p>
     <w:p>

</xml_diff>

<commit_message>
Quinto Commit: Informe terminado
</commit_message>
<xml_diff>
--- a/informe.docx
+++ b/informe.docx
@@ -480,7 +480,91 @@
         <w:t>:</w:t>
       </w:r>
       <w:r>
-        <w:t xml:space="preserve"> En primer lugar, es saber dónde sacar la pieza nueva en el tablero ya que cada tablero puede tener diferente tamaño siendo múltiplos de 8, cada pieza nueva debe salir en el centro del ancho definido por el usuario. En segundo lugar, esta evitar el desbordamiento de las piezas cuando estas se acercan a los bordes laterales del tablero, lo cual requiere hacer validaciones constantes de estos bordes.</w:t>
+        <w:t xml:space="preserve"> En primer lugar, es saber dónde sacar la pieza nueva en el tablero ya que cada tablero puede tener diferente tamaño siendo múltiplos de 8, </w:t>
+      </w:r>
+      <w:r>
+        <w:rPr>
+          <w:u w:val="single"/>
+        </w:rPr>
+        <w:t>cada pieza nueva debe salir en el centro del ancho definido por el usuario</w:t>
+      </w:r>
+      <w:r>
+        <w:t xml:space="preserve">. En segundo lugar, esta </w:t>
+      </w:r>
+      <w:r>
+        <w:rPr>
+          <w:u w:val="single"/>
+        </w:rPr>
+        <w:t>evitar el desbordamiento de las piezas cuando estas se acercan a los bordes laterales del tablero</w:t>
+      </w:r>
+      <w:r>
+        <w:t>, lo cual requiere hacer validaciones constantes de estos bordes.</w:t>
+      </w:r>
+    </w:p>
+    <w:p>
+      <w:pPr>
+        <w:pStyle w:val="Prrafodelista"/>
+        <w:spacing w:line="360" w:lineRule="auto"/>
+      </w:pPr>
+    </w:p>
+    <w:p>
+      <w:pPr>
+        <w:pStyle w:val="Prrafodelista"/>
+        <w:numPr>
+          <w:ilvl w:val="0"/>
+          <w:numId w:val="1"/>
+        </w:numPr>
+        <w:spacing w:line="360" w:lineRule="auto"/>
+        <w:rPr>
+          <w:b/>
+          <w:bCs/>
+        </w:rPr>
+      </w:pPr>
+      <w:r>
+        <w:rPr>
+          <w:b/>
+          <w:bCs/>
+        </w:rPr>
+        <w:t>Evolución de la solución y consideraciones para tener en cuenta en la implementación:</w:t>
+      </w:r>
+    </w:p>
+    <w:p>
+      <w:pPr>
+        <w:pStyle w:val="Prrafodelista"/>
+        <w:spacing w:line="360" w:lineRule="auto"/>
+      </w:pPr>
+      <w:r>
+        <w:t xml:space="preserve">Al principio, había pensado en una solución mas sencilla a simple vista que era usar matrices (arreglos), lo cual me iba a facilitar varias etapas del desarrollo del juego, pero revisando el desafío me di cuenta que no era viable ya que no cumplía requerimientos. También, me di cuenta que debía tener en cuenta el uso de archivos </w:t>
+      </w:r>
+      <w:r>
+        <w:rPr>
+          <w:u w:val="single"/>
+        </w:rPr>
+        <w:t>.h</w:t>
+      </w:r>
+      <w:r>
+        <w:t xml:space="preserve"> y </w:t>
+      </w:r>
+      <w:r>
+        <w:rPr>
+          <w:u w:val="single"/>
+        </w:rPr>
+        <w:t>.cpp</w:t>
+      </w:r>
+      <w:r>
+        <w:t xml:space="preserve"> para separar la lógica del juego de la parte visual.</w:t>
+      </w:r>
+      <w:r>
+        <w:t xml:space="preserve"> </w:t>
+      </w:r>
+    </w:p>
+    <w:p>
+      <w:pPr>
+        <w:pStyle w:val="Prrafodelista"/>
+        <w:spacing w:line="360" w:lineRule="auto"/>
+      </w:pPr>
+      <w:r>
+        <w:t>Además, que es importante el uso de punteros para cumplir con la parte de la gestión de memoria dinámica y eficiente.</w:t>
       </w:r>
     </w:p>
     <w:p>

</xml_diff>

<commit_message>
Correccion: Se agrega enlace a video de YouTube
</commit_message>
<xml_diff>
--- a/informe.docx
+++ b/informe.docx
@@ -71,6 +71,46 @@
     <w:p>
       <w:pPr>
         <w:spacing w:line="360" w:lineRule="auto"/>
+        <w:rPr>
+          <w:b/>
+          <w:bCs/>
+        </w:rPr>
+      </w:pPr>
+      <w:r>
+        <w:rPr>
+          <w:b/>
+          <w:bCs/>
+        </w:rPr>
+        <w:t>Video de YouTube:</w:t>
+      </w:r>
+      <w:r>
+        <w:rPr>
+          <w:b/>
+          <w:bCs/>
+        </w:rPr>
+        <w:t xml:space="preserve"> </w:t>
+      </w:r>
+      <w:hyperlink r:id="rId5" w:history="1">
+        <w:r>
+          <w:rPr>
+            <w:rStyle w:val="Hipervnculo"/>
+            <w:b/>
+            <w:bCs/>
+          </w:rPr>
+          <w:t>https://youtu.be/5ZBTwZh0kCk</w:t>
+        </w:r>
+      </w:hyperlink>
+      <w:r>
+        <w:rPr>
+          <w:b/>
+          <w:bCs/>
+        </w:rPr>
+        <w:t xml:space="preserve"> </w:t>
+      </w:r>
+    </w:p>
+    <w:p>
+      <w:pPr>
+        <w:spacing w:line="360" w:lineRule="auto"/>
       </w:pPr>
     </w:p>
     <w:p>
@@ -290,8 +330,16 @@
         <w:rPr>
           <w:u w:val="single"/>
         </w:rPr>
-        <w:t>detecten las colisiones de las mascaras</w:t>
-      </w:r>
+        <w:t xml:space="preserve">detecten las colisiones de las </w:t>
+      </w:r>
+      <w:proofErr w:type="spellStart"/>
+      <w:r>
+        <w:rPr>
+          <w:u w:val="single"/>
+        </w:rPr>
+        <w:t>mascaras</w:t>
+      </w:r>
+      <w:proofErr w:type="spellEnd"/>
       <w:r>
         <w:t xml:space="preserve"> de las piezas con el estado actual que tenga el tablero en un momento dado. Acá es importante el operador &amp; para asegurar la veracidad de varias condiciones.</w:t>
       </w:r>
@@ -312,7 +360,15 @@
         <w:t>S</w:t>
       </w:r>
       <w:r>
-        <w:t>e hace necesario saber como con cada mascara sucesiva el</w:t>
+        <w:t xml:space="preserve">e hace necesario saber </w:t>
+      </w:r>
+      <w:proofErr w:type="spellStart"/>
+      <w:r>
+        <w:t>como</w:t>
+      </w:r>
+      <w:proofErr w:type="spellEnd"/>
+      <w:r>
+        <w:t xml:space="preserve"> con cada mascara sucesiva el</w:t>
       </w:r>
       <w:r>
         <w:rPr>
@@ -377,6 +433,7 @@
           <w:b/>
           <w:bCs/>
         </w:rPr>
+        <w:lastRenderedPageBreak/>
         <w:t xml:space="preserve">Primero: </w:t>
       </w:r>
       <w:r>
@@ -417,7 +474,6 @@
           <w:b/>
           <w:bCs/>
         </w:rPr>
-        <w:lastRenderedPageBreak/>
         <w:t xml:space="preserve">Segundo: </w:t>
       </w:r>
       <w:r>
@@ -534,7 +590,15 @@
         <w:spacing w:line="360" w:lineRule="auto"/>
       </w:pPr>
       <w:r>
-        <w:t xml:space="preserve">Al principio, había pensado en una solución mas sencilla a simple vista que era usar matrices (arreglos), lo cual me iba a facilitar varias etapas del desarrollo del juego, pero revisando el desafío me di cuenta que no era viable ya que no cumplía requerimientos. También, me di cuenta que debía tener en cuenta el uso de archivos </w:t>
+        <w:t xml:space="preserve">Al principio, había pensado en una solución </w:t>
+      </w:r>
+      <w:proofErr w:type="spellStart"/>
+      <w:r>
+        <w:t>mas</w:t>
+      </w:r>
+      <w:proofErr w:type="spellEnd"/>
+      <w:r>
+        <w:t xml:space="preserve"> sencilla a simple vista que era usar matrices (arreglos), lo cual me iba a facilitar varias etapas del desarrollo del juego, pero revisando el desafío me di cuenta que no era viable ya que no cumplía requerimientos. También, me di cuenta que debía tener en cuenta el uso de archivos </w:t>
       </w:r>
       <w:r>
         <w:rPr>
@@ -1238,6 +1302,29 @@
       <w:contextualSpacing/>
     </w:pPr>
   </w:style>
+  <w:style w:type="character" w:styleId="Hipervnculo">
+    <w:name w:val="Hyperlink"/>
+    <w:basedOn w:val="Fuentedeprrafopredeter"/>
+    <w:uiPriority w:val="99"/>
+    <w:unhideWhenUsed/>
+    <w:rsid w:val="008822C4"/>
+    <w:rPr>
+      <w:color w:val="0563C1" w:themeColor="hyperlink"/>
+      <w:u w:val="single"/>
+    </w:rPr>
+  </w:style>
+  <w:style w:type="character" w:styleId="Mencinsinresolver">
+    <w:name w:val="Unresolved Mention"/>
+    <w:basedOn w:val="Fuentedeprrafopredeter"/>
+    <w:uiPriority w:val="99"/>
+    <w:semiHidden/>
+    <w:unhideWhenUsed/>
+    <w:rsid w:val="008822C4"/>
+    <w:rPr>
+      <w:color w:val="605E5C"/>
+      <w:shd w:val="clear" w:color="auto" w:fill="E1DFDD"/>
+    </w:rPr>
+  </w:style>
 </w:styles>
 </file>
 

</xml_diff>